<commit_message>
docs(engineering): rebuild UML diagrams and verified deliverables
</commit_message>
<xml_diff>
--- a/docs/laboratorio-engenharia-software/entregaveis/01-documento-de-visao-stacklyst.docx
+++ b/docs/laboratorio-engenharia-software/entregaveis/01-documento-de-visao-stacklyst.docx
@@ -11,13 +11,15 @@
     <w:p/>
     <w:p>
       <w:pPr>
+        <w:pStyle w:val="Ttulo20"/>
         <w:spacing w:after="280"/>
         <w:jc w:val="center"/>
       </w:pPr>
       <w:r>
         <w:rPr>
+          <w:rFonts w:ascii="Arial" w:hAnsi="Arial"/>
           <w:b/>
-          <w:color w:val="1F4E78"/>
+          <w:color w:val="000000"/>
           <w:sz w:val="60"/>
         </w:rPr>
         <w:t>Stacklyst</w:t>
@@ -70,7 +72,7 @@
       <w:pPr>
         <w:pStyle w:val="Ttulo1"/>
       </w:pPr>
-      <w:bookmarkStart w:id="0" w:name="_Toc238247496"/>
+      <w:bookmarkStart w:id="0" w:name="_Toc239529441"/>
       <w:r>
         <w:t>1. Índice</w:t>
       </w:r>
@@ -100,7 +102,7 @@
       <w:r>
         <w:fldChar w:fldCharType="separate"/>
       </w:r>
-      <w:hyperlink w:anchor="_Toc238247496" w:history="1">
+      <w:hyperlink w:anchor="_Toc239529441" w:history="1">
         <w:r>
           <w:rPr>
             <w:rStyle w:val="Hyperlink"/>
@@ -127,7 +129,7 @@
             <w:noProof/>
             <w:webHidden/>
           </w:rPr>
-          <w:instrText xml:space="preserve"> PAGEREF _Toc238247496 \h </w:instrText>
+          <w:instrText xml:space="preserve"> PAGEREF _Toc239529441 \h </w:instrText>
         </w:r>
         <w:r>
           <w:rPr>
@@ -173,7 +175,7 @@
           <w14:ligatures w14:val="standardContextual"/>
         </w:rPr>
       </w:pPr>
-      <w:hyperlink w:anchor="_Toc238247497" w:history="1">
+      <w:hyperlink w:anchor="_Toc239529442" w:history="1">
         <w:r>
           <w:rPr>
             <w:rStyle w:val="Hyperlink"/>
@@ -200,7 +202,7 @@
             <w:noProof/>
             <w:webHidden/>
           </w:rPr>
-          <w:instrText xml:space="preserve"> PAGEREF _Toc238247497 \h </w:instrText>
+          <w:instrText xml:space="preserve"> PAGEREF _Toc239529442 \h </w:instrText>
         </w:r>
         <w:r>
           <w:rPr>
@@ -246,7 +248,7 @@
           <w14:ligatures w14:val="standardContextual"/>
         </w:rPr>
       </w:pPr>
-      <w:hyperlink w:anchor="_Toc238247498" w:history="1">
+      <w:hyperlink w:anchor="_Toc239529443" w:history="1">
         <w:r>
           <w:rPr>
             <w:rStyle w:val="Hyperlink"/>
@@ -273,7 +275,7 @@
             <w:noProof/>
             <w:webHidden/>
           </w:rPr>
-          <w:instrText xml:space="preserve"> PAGEREF _Toc238247498 \h </w:instrText>
+          <w:instrText xml:space="preserve"> PAGEREF _Toc239529443 \h </w:instrText>
         </w:r>
         <w:r>
           <w:rPr>
@@ -319,7 +321,7 @@
           <w14:ligatures w14:val="standardContextual"/>
         </w:rPr>
       </w:pPr>
-      <w:hyperlink w:anchor="_Toc238247499" w:history="1">
+      <w:hyperlink w:anchor="_Toc239529444" w:history="1">
         <w:r>
           <w:rPr>
             <w:rStyle w:val="Hyperlink"/>
@@ -346,7 +348,7 @@
             <w:noProof/>
             <w:webHidden/>
           </w:rPr>
-          <w:instrText xml:space="preserve"> PAGEREF _Toc238247499 \h </w:instrText>
+          <w:instrText xml:space="preserve"> PAGEREF _Toc239529444 \h </w:instrText>
         </w:r>
         <w:r>
           <w:rPr>
@@ -392,7 +394,7 @@
           <w14:ligatures w14:val="standardContextual"/>
         </w:rPr>
       </w:pPr>
-      <w:hyperlink w:anchor="_Toc238247500" w:history="1">
+      <w:hyperlink w:anchor="_Toc239529445" w:history="1">
         <w:r>
           <w:rPr>
             <w:rStyle w:val="Hyperlink"/>
@@ -419,7 +421,7 @@
             <w:noProof/>
             <w:webHidden/>
           </w:rPr>
-          <w:instrText xml:space="preserve"> PAGEREF _Toc238247500 \h </w:instrText>
+          <w:instrText xml:space="preserve"> PAGEREF _Toc239529445 \h </w:instrText>
         </w:r>
         <w:r>
           <w:rPr>
@@ -465,7 +467,7 @@
           <w14:ligatures w14:val="standardContextual"/>
         </w:rPr>
       </w:pPr>
-      <w:hyperlink w:anchor="_Toc238247501" w:history="1">
+      <w:hyperlink w:anchor="_Toc239529446" w:history="1">
         <w:r>
           <w:rPr>
             <w:rStyle w:val="Hyperlink"/>
@@ -492,7 +494,7 @@
             <w:noProof/>
             <w:webHidden/>
           </w:rPr>
-          <w:instrText xml:space="preserve"> PAGEREF _Toc238247501 \h </w:instrText>
+          <w:instrText xml:space="preserve"> PAGEREF _Toc239529446 \h </w:instrText>
         </w:r>
         <w:r>
           <w:rPr>
@@ -538,7 +540,7 @@
           <w14:ligatures w14:val="standardContextual"/>
         </w:rPr>
       </w:pPr>
-      <w:hyperlink w:anchor="_Toc238247502" w:history="1">
+      <w:hyperlink w:anchor="_Toc239529447" w:history="1">
         <w:r>
           <w:rPr>
             <w:rStyle w:val="Hyperlink"/>
@@ -565,7 +567,7 @@
             <w:noProof/>
             <w:webHidden/>
           </w:rPr>
-          <w:instrText xml:space="preserve"> PAGEREF _Toc238247502 \h </w:instrText>
+          <w:instrText xml:space="preserve"> PAGEREF _Toc239529447 \h </w:instrText>
         </w:r>
         <w:r>
           <w:rPr>
@@ -611,7 +613,7 @@
           <w14:ligatures w14:val="standardContextual"/>
         </w:rPr>
       </w:pPr>
-      <w:hyperlink w:anchor="_Toc238247503" w:history="1">
+      <w:hyperlink w:anchor="_Toc239529448" w:history="1">
         <w:r>
           <w:rPr>
             <w:rStyle w:val="Hyperlink"/>
@@ -638,7 +640,7 @@
             <w:noProof/>
             <w:webHidden/>
           </w:rPr>
-          <w:instrText xml:space="preserve"> PAGEREF _Toc238247503 \h </w:instrText>
+          <w:instrText xml:space="preserve"> PAGEREF _Toc239529448 \h </w:instrText>
         </w:r>
         <w:r>
           <w:rPr>
@@ -684,7 +686,7 @@
           <w14:ligatures w14:val="standardContextual"/>
         </w:rPr>
       </w:pPr>
-      <w:hyperlink w:anchor="_Toc238247504" w:history="1">
+      <w:hyperlink w:anchor="_Toc239529449" w:history="1">
         <w:r>
           <w:rPr>
             <w:rStyle w:val="Hyperlink"/>
@@ -711,7 +713,7 @@
             <w:noProof/>
             <w:webHidden/>
           </w:rPr>
-          <w:instrText xml:space="preserve"> PAGEREF _Toc238247504 \h </w:instrText>
+          <w:instrText xml:space="preserve"> PAGEREF _Toc239529449 \h </w:instrText>
         </w:r>
         <w:r>
           <w:rPr>
@@ -757,7 +759,7 @@
           <w14:ligatures w14:val="standardContextual"/>
         </w:rPr>
       </w:pPr>
-      <w:hyperlink w:anchor="_Toc238247505" w:history="1">
+      <w:hyperlink w:anchor="_Toc239529450" w:history="1">
         <w:r>
           <w:rPr>
             <w:rStyle w:val="Hyperlink"/>
@@ -784,7 +786,7 @@
             <w:noProof/>
             <w:webHidden/>
           </w:rPr>
-          <w:instrText xml:space="preserve"> PAGEREF _Toc238247505 \h </w:instrText>
+          <w:instrText xml:space="preserve"> PAGEREF _Toc239529450 \h </w:instrText>
         </w:r>
         <w:r>
           <w:rPr>
@@ -830,7 +832,7 @@
           <w14:ligatures w14:val="standardContextual"/>
         </w:rPr>
       </w:pPr>
-      <w:hyperlink w:anchor="_Toc238247506" w:history="1">
+      <w:hyperlink w:anchor="_Toc239529451" w:history="1">
         <w:r>
           <w:rPr>
             <w:rStyle w:val="Hyperlink"/>
@@ -857,7 +859,7 @@
             <w:noProof/>
             <w:webHidden/>
           </w:rPr>
-          <w:instrText xml:space="preserve"> PAGEREF _Toc238247506 \h </w:instrText>
+          <w:instrText xml:space="preserve"> PAGEREF _Toc239529451 \h </w:instrText>
         </w:r>
         <w:r>
           <w:rPr>
@@ -902,7 +904,7 @@
       <w:pPr>
         <w:pStyle w:val="Ttulo1"/>
       </w:pPr>
-      <w:bookmarkStart w:id="1" w:name="_Toc238247497"/>
+      <w:bookmarkStart w:id="1" w:name="_Toc239529442"/>
       <w:r>
         <w:t>2. Objetivo</w:t>
       </w:r>
@@ -927,7 +929,7 @@
       <w:pPr>
         <w:pStyle w:val="Ttulo1"/>
       </w:pPr>
-      <w:bookmarkStart w:id="2" w:name="_Toc238247498"/>
+      <w:bookmarkStart w:id="2" w:name="_Toc239529443"/>
       <w:r>
         <w:t>3. Necessidade do Negócio</w:t>
       </w:r>
@@ -952,7 +954,7 @@
       <w:pPr>
         <w:pStyle w:val="Ttulo1"/>
       </w:pPr>
-      <w:bookmarkStart w:id="3" w:name="_Toc238247499"/>
+      <w:bookmarkStart w:id="3" w:name="_Toc239529444"/>
       <w:r>
         <w:t>4. Descrição do Escopo</w:t>
       </w:r>
@@ -962,7 +964,7 @@
       <w:pPr>
         <w:pStyle w:val="Ttulo2"/>
       </w:pPr>
-      <w:bookmarkStart w:id="4" w:name="_Toc238247500"/>
+      <w:bookmarkStart w:id="4" w:name="_Toc239529445"/>
       <w:r>
         <w:t>4.1 Dentro do escopo</w:t>
       </w:r>
@@ -1225,7 +1227,7 @@
               <w:rPr>
                 <w:sz w:val="14"/>
               </w:rPr>
-              <w:t>Percursos por linguagem, preferências de curso, níveis e checkpoints.</w:t>
+              <w:t>Catálogo versionado com unidades, lições e exercícios; mapa e lista compartilham os nós e estados.</w:t>
             </w:r>
           </w:p>
         </w:tc>
@@ -1257,7 +1259,7 @@
               <w:rPr>
                 <w:sz w:val="14"/>
               </w:rPr>
-              <w:t>src/app/trails; src/lib/trails; src/app/api/trails</w:t>
+              <w:t>src/lib/learning/catalog.ts; src/app/trails/LearningJourney.tsx</w:t>
             </w:r>
           </w:p>
         </w:tc>
@@ -1365,7 +1367,7 @@
               <w:rPr>
                 <w:sz w:val="14"/>
               </w:rPr>
-              <w:t>Múltipla escolha, lacunas, ordenação, associação, terminal, editor e blocos.</w:t>
+              <w:t>Avaliação no servidor com respostas canônicas e execução remota de código.</w:t>
             </w:r>
           </w:p>
         </w:tc>
@@ -1397,7 +1399,7 @@
               <w:rPr>
                 <w:sz w:val="14"/>
               </w:rPr>
-              <w:t>src/lib/lessons/evaluators.ts</w:t>
+              <w:t>src/lib/learning/assessment.ts; src/lib/exercises/evaluator.ts</w:t>
             </w:r>
           </w:p>
         </w:tc>
@@ -1575,7 +1577,7 @@
               <w:rPr>
                 <w:sz w:val="14"/>
               </w:rPr>
-              <w:t>Busca imediata por faixa de XP com expansão progressiva; não há fila persistente de espera.</w:t>
+              <w:t>Convites por faixa de XP coexistem com a arena persistida em PENDING.</w:t>
             </w:r>
           </w:p>
         </w:tc>
@@ -1591,7 +1593,7 @@
               <w:rPr>
                 <w:sz w:val="14"/>
               </w:rPr>
-              <w:t>Implementado parcialmente</w:t>
+              <w:t>Implementado</w:t>
             </w:r>
           </w:p>
         </w:tc>
@@ -1607,7 +1609,7 @@
               <w:rPr>
                 <w:sz w:val="14"/>
               </w:rPr>
-              <w:t>src/services/duel.service.ts</w:t>
+              <w:t>src/services/duel.service.ts; src/app/api/duels/route.ts; src/lib/duels/lifecycle.ts</w:t>
             </w:r>
           </w:p>
         </w:tc>
@@ -1629,6 +1631,7 @@
               <w:rPr>
                 <w:sz w:val="14"/>
               </w:rPr>
+              <w:lastRenderedPageBreak/>
               <w:t>Avaliações</w:t>
             </w:r>
           </w:p>
@@ -1699,8 +1702,7 @@
               <w:rPr>
                 <w:sz w:val="14"/>
               </w:rPr>
-              <w:lastRenderedPageBreak/>
-              <w:t>IA educacional</w:t>
+              <w:t>Avaliadores</w:t>
             </w:r>
           </w:p>
         </w:tc>
@@ -1716,7 +1718,7 @@
               <w:rPr>
                 <w:sz w:val="14"/>
               </w:rPr>
-              <w:t>Tutor e análise de repositório sob demanda, com provedores opcionais e limites.</w:t>
+              <w:t>Elegibilidade, candidatura, aprovação administrativa e parecer técnico.</w:t>
             </w:r>
           </w:p>
         </w:tc>
@@ -1732,7 +1734,7 @@
               <w:rPr>
                 <w:sz w:val="14"/>
               </w:rPr>
-              <w:t>Implementado parcialmente</w:t>
+              <w:t>Implementado</w:t>
             </w:r>
           </w:p>
         </w:tc>
@@ -1748,7 +1750,7 @@
               <w:rPr>
                 <w:sz w:val="14"/>
               </w:rPr>
-              <w:t>src/app/api/ai; src/lib/ai</w:t>
+              <w:t>src/app/evaluators; src/app/evaluations; src/services/evaluator.service.ts</w:t>
             </w:r>
           </w:p>
         </w:tc>
@@ -1770,7 +1772,7 @@
               <w:rPr>
                 <w:sz w:val="14"/>
               </w:rPr>
-              <w:t>Avaliadores</w:t>
+              <w:t>XP, níveis e sequência</w:t>
             </w:r>
           </w:p>
         </w:tc>
@@ -1786,7 +1788,7 @@
               <w:rPr>
                 <w:sz w:val="14"/>
               </w:rPr>
-              <w:t>Elegibilidade, candidatura, aprovação administrativa e parecer técnico.</w:t>
+              <w:t>Pontuação transacional, níveis e ofensiva por atividade.</w:t>
             </w:r>
           </w:p>
         </w:tc>
@@ -1818,7 +1820,7 @@
               <w:rPr>
                 <w:sz w:val="14"/>
               </w:rPr>
-              <w:t>src/app/evaluators; src/app/evaluations; src/services/evaluator.service.ts</w:t>
+              <w:t>src/services/xp.service.ts; src/lib/streak.ts</w:t>
             </w:r>
           </w:p>
         </w:tc>
@@ -1840,7 +1842,7 @@
               <w:rPr>
                 <w:sz w:val="14"/>
               </w:rPr>
-              <w:t>XP, níveis e sequência</w:t>
+              <w:t>Conquistas</w:t>
             </w:r>
           </w:p>
         </w:tc>
@@ -1856,7 +1858,7 @@
               <w:rPr>
                 <w:sz w:val="14"/>
               </w:rPr>
-              <w:t>Pontuação transacional, níveis e ofensiva por atividade.</w:t>
+              <w:t>Badges por critérios de atividade e sequência.</w:t>
             </w:r>
           </w:p>
         </w:tc>
@@ -1888,7 +1890,7 @@
               <w:rPr>
                 <w:sz w:val="14"/>
               </w:rPr>
-              <w:t>src/services/xp.service.ts; src/lib/streak.ts</w:t>
+              <w:t>prisma/schema.prisma; src/services/xp.service.ts</w:t>
             </w:r>
           </w:p>
         </w:tc>
@@ -1910,7 +1912,7 @@
               <w:rPr>
                 <w:sz w:val="14"/>
               </w:rPr>
-              <w:t>Conquistas</w:t>
+              <w:t>Ranking e divisões</w:t>
             </w:r>
           </w:p>
         </w:tc>
@@ -1926,7 +1928,7 @@
               <w:rPr>
                 <w:sz w:val="14"/>
               </w:rPr>
-              <w:t>Badges por critérios de atividade e sequência.</w:t>
+              <w:t>Ranking por XP e faixas Bronze a Diamante; não implementa rating Elo.</w:t>
             </w:r>
           </w:p>
         </w:tc>
@@ -1958,7 +1960,7 @@
               <w:rPr>
                 <w:sz w:val="14"/>
               </w:rPr>
-              <w:t>prisma/schema.prisma; src/services/xp.service.ts</w:t>
+              <w:t>src/lib/learning/rewards.ts; language-xp.ts</w:t>
             </w:r>
           </w:p>
         </w:tc>
@@ -1980,7 +1982,7 @@
               <w:rPr>
                 <w:sz w:val="14"/>
               </w:rPr>
-              <w:t>Ranking e divisões</w:t>
+              <w:t>Comunidade</w:t>
             </w:r>
           </w:p>
         </w:tc>
@@ -1996,7 +1998,7 @@
               <w:rPr>
                 <w:sz w:val="14"/>
               </w:rPr>
-              <w:t>Ranking global/por linguagem e faixas Bronze a Diamante usadas nos duelos.</w:t>
+              <w:t>Feed, publicações, respostas, reações, votos, favoritos, seguidores e mensagens.</w:t>
             </w:r>
           </w:p>
         </w:tc>
@@ -2012,7 +2014,7 @@
               <w:rPr>
                 <w:sz w:val="14"/>
               </w:rPr>
-              <w:t>Implementado parcialmente</w:t>
+              <w:t>Implementado</w:t>
             </w:r>
           </w:p>
         </w:tc>
@@ -2028,7 +2030,7 @@
               <w:rPr>
                 <w:sz w:val="14"/>
               </w:rPr>
-              <w:t>src/app/api/leaderboard; src/services/duel.service.ts</w:t>
+              <w:t>src/app/feed; src/services/post.service.ts; src/app/api/posts</w:t>
             </w:r>
           </w:p>
         </w:tc>
@@ -2050,7 +2052,7 @@
               <w:rPr>
                 <w:sz w:val="14"/>
               </w:rPr>
-              <w:t>Comunidade</w:t>
+              <w:t>Eventos</w:t>
             </w:r>
           </w:p>
         </w:tc>
@@ -2066,7 +2068,7 @@
               <w:rPr>
                 <w:sz w:val="14"/>
               </w:rPr>
-              <w:t>Feed, publicações, respostas, reações, votos, favoritos, seguidores e mensagens.</w:t>
+              <w:t>Listagem, criação e participação em eventos/desafios comunitários.</w:t>
             </w:r>
           </w:p>
         </w:tc>
@@ -2082,7 +2084,7 @@
               <w:rPr>
                 <w:sz w:val="14"/>
               </w:rPr>
-              <w:t>Implementado</w:t>
+              <w:t>Implementado parcialmente</w:t>
             </w:r>
           </w:p>
         </w:tc>
@@ -2098,7 +2100,7 @@
               <w:rPr>
                 <w:sz w:val="14"/>
               </w:rPr>
-              <w:t>src/app/feed; src/services/post.service.ts; src/app/api/posts</w:t>
+              <w:t>src/app/events; src/services/event.service.ts</w:t>
             </w:r>
           </w:p>
         </w:tc>
@@ -2120,7 +2122,7 @@
               <w:rPr>
                 <w:sz w:val="14"/>
               </w:rPr>
-              <w:t>Eventos</w:t>
+              <w:t>Notificações</w:t>
             </w:r>
           </w:p>
         </w:tc>
@@ -2136,7 +2138,7 @@
               <w:rPr>
                 <w:sz w:val="14"/>
               </w:rPr>
-              <w:t>Listagem, criação e participação em eventos/desafios comunitários.</w:t>
+              <w:t>Central web e tipos de eventos da plataforma.</w:t>
             </w:r>
           </w:p>
         </w:tc>
@@ -2152,7 +2154,7 @@
               <w:rPr>
                 <w:sz w:val="14"/>
               </w:rPr>
-              <w:t>Implementado parcialmente</w:t>
+              <w:t>Implementado na web</w:t>
             </w:r>
           </w:p>
         </w:tc>
@@ -2168,7 +2170,7 @@
               <w:rPr>
                 <w:sz w:val="14"/>
               </w:rPr>
-              <w:t>src/app/events; src/services/event.service.ts</w:t>
+              <w:t>src/app/notifications; src/services/notification.service.ts</w:t>
             </w:r>
           </w:p>
         </w:tc>
@@ -2190,7 +2192,7 @@
               <w:rPr>
                 <w:sz w:val="14"/>
               </w:rPr>
-              <w:t>Notificações</w:t>
+              <w:t>Aplicação mobile</w:t>
             </w:r>
           </w:p>
         </w:tc>
@@ -2206,7 +2208,7 @@
               <w:rPr>
                 <w:sz w:val="14"/>
               </w:rPr>
-              <w:t>Central web e tipos de eventos da plataforma.</w:t>
+              <w:t>Recebimento de push e consulta de informações selecionadas.</w:t>
             </w:r>
           </w:p>
         </w:tc>
@@ -2222,7 +2224,7 @@
               <w:rPr>
                 <w:sz w:val="14"/>
               </w:rPr>
-              <w:t>Implementado na web</w:t>
+              <w:t>Planejado</w:t>
             </w:r>
           </w:p>
         </w:tc>
@@ -2238,7 +2240,7 @@
               <w:rPr>
                 <w:sz w:val="14"/>
               </w:rPr>
-              <w:t>src/app/notifications; src/services/notification.service.ts</w:t>
+              <w:t>[ANOTAÇÃO — DECISÃO TÉCNICA PENDENTE]</w:t>
             </w:r>
           </w:p>
         </w:tc>
@@ -2260,7 +2262,7 @@
               <w:rPr>
                 <w:sz w:val="14"/>
               </w:rPr>
-              <w:t>Aplicação mobile</w:t>
+              <w:t>Vagas e empresas</w:t>
             </w:r>
           </w:p>
         </w:tc>
@@ -2276,7 +2278,7 @@
               <w:rPr>
                 <w:sz w:val="14"/>
               </w:rPr>
-              <w:t>Recebimento de push e consulta de informações selecionadas.</w:t>
+              <w:t>Cadastro de empresa, publicação, consulta e candidatura a oportunidades.</w:t>
             </w:r>
           </w:p>
         </w:tc>
@@ -2292,7 +2294,7 @@
               <w:rPr>
                 <w:sz w:val="14"/>
               </w:rPr>
-              <w:t>Planejado</w:t>
+              <w:t>Implementado parcialmente</w:t>
             </w:r>
           </w:p>
         </w:tc>
@@ -2308,7 +2310,7 @@
               <w:rPr>
                 <w:sz w:val="14"/>
               </w:rPr>
-              <w:t>[ANOTAÇÃO — DECISÃO TÉCNICA PENDENTE]</w:t>
+              <w:t>src/app/jobs; src/app/recruiter; src/services/job.service.ts</w:t>
             </w:r>
           </w:p>
         </w:tc>
@@ -2330,7 +2332,7 @@
               <w:rPr>
                 <w:sz w:val="14"/>
               </w:rPr>
-              <w:t>Vagas e empresas</w:t>
+              <w:t>Administração</w:t>
             </w:r>
           </w:p>
         </w:tc>
@@ -2346,7 +2348,7 @@
               <w:rPr>
                 <w:sz w:val="14"/>
               </w:rPr>
-              <w:t>Cadastro de empresa, publicação, consulta e candidatura a oportunidades.</w:t>
+              <w:t>Usuários, papéis, denúncias, avaliadores, métricas e geração administrativa de quiz.</w:t>
             </w:r>
           </w:p>
         </w:tc>
@@ -2378,7 +2380,7 @@
               <w:rPr>
                 <w:sz w:val="14"/>
               </w:rPr>
-              <w:t>src/app/jobs; src/app/recruiter; src/services/job.service.ts</w:t>
+              <w:t>src/app/admin; src/app/api/admin</w:t>
             </w:r>
           </w:p>
         </w:tc>
@@ -2400,76 +2402,6 @@
               <w:rPr>
                 <w:sz w:val="14"/>
               </w:rPr>
-              <w:t>Administração</w:t>
-            </w:r>
-          </w:p>
-        </w:tc>
-        <w:tc>
-          <w:tcPr>
-            <w:tcW w:w="3960" w:type="dxa"/>
-          </w:tcPr>
-          <w:p>
-            <w:pPr>
-              <w:spacing w:after="0"/>
-            </w:pPr>
-            <w:r>
-              <w:rPr>
-                <w:sz w:val="14"/>
-              </w:rPr>
-              <w:t>Usuários, papéis, denúncias, avaliadores, métricas e geração administrativa de quiz.</w:t>
-            </w:r>
-          </w:p>
-        </w:tc>
-        <w:tc>
-          <w:tcPr>
-            <w:tcW w:w="1512" w:type="dxa"/>
-          </w:tcPr>
-          <w:p>
-            <w:pPr>
-              <w:spacing w:after="0"/>
-            </w:pPr>
-            <w:r>
-              <w:rPr>
-                <w:sz w:val="14"/>
-              </w:rPr>
-              <w:t>Implementado parcialmente</w:t>
-            </w:r>
-          </w:p>
-        </w:tc>
-        <w:tc>
-          <w:tcPr>
-            <w:tcW w:w="2304" w:type="dxa"/>
-          </w:tcPr>
-          <w:p>
-            <w:pPr>
-              <w:spacing w:after="0"/>
-            </w:pPr>
-            <w:r>
-              <w:rPr>
-                <w:sz w:val="14"/>
-              </w:rPr>
-              <w:t>src/app/admin; src/app/api/admin</w:t>
-            </w:r>
-          </w:p>
-        </w:tc>
-      </w:tr>
-      <w:tr>
-        <w:trPr>
-          <w:cantSplit/>
-          <w:jc w:val="center"/>
-        </w:trPr>
-        <w:tc>
-          <w:tcPr>
-            <w:tcW w:w="1944" w:type="dxa"/>
-          </w:tcPr>
-          <w:p>
-            <w:pPr>
-              <w:spacing w:after="0"/>
-            </w:pPr>
-            <w:r>
-              <w:rPr>
-                <w:sz w:val="14"/>
-              </w:rPr>
               <w:t>Acompanhamento de progresso</w:t>
             </w:r>
           </w:p>
@@ -2533,7 +2465,7 @@
       <w:pPr>
         <w:pStyle w:val="Ttulo2"/>
       </w:pPr>
-      <w:bookmarkStart w:id="5" w:name="_Toc238247501"/>
+      <w:bookmarkStart w:id="5" w:name="_Toc239529446"/>
       <w:r>
         <w:t>4.2 Fora do escopo da primeira versão</w:t>
       </w:r>
@@ -2607,7 +2539,7 @@
       <w:pPr>
         <w:pStyle w:val="Ttulo1"/>
       </w:pPr>
-      <w:bookmarkStart w:id="6" w:name="_Toc238247502"/>
+      <w:bookmarkStart w:id="6" w:name="_Toc239529447"/>
       <w:r>
         <w:t>5. Equipe</w:t>
       </w:r>
@@ -2903,7 +2835,7 @@
       <w:pPr>
         <w:pStyle w:val="Ttulo1"/>
       </w:pPr>
-      <w:bookmarkStart w:id="7" w:name="_Toc238247503"/>
+      <w:bookmarkStart w:id="7" w:name="_Toc239529448"/>
       <w:r>
         <w:lastRenderedPageBreak/>
         <w:t>6. Especificações Técnicas</w:t>
@@ -3215,7 +3147,7 @@
               <w:rPr>
                 <w:sz w:val="15"/>
               </w:rPr>
-              <w:t>IA</w:t>
+              <w:t>Aplicação Mobile</w:t>
             </w:r>
           </w:p>
         </w:tc>
@@ -3231,7 +3163,7 @@
               <w:rPr>
                 <w:sz w:val="15"/>
               </w:rPr>
-              <w:t>Camada opcional com Ollama, Groq, Gemini ou API compatível; prompts especializados, validação e rate limit. Uso auxiliar.</w:t>
+              <w:t>[ANOTAÇÃO — DECISÃO TÉCNICA PENDENTE]: não existe aplicativo mobile no repositório auditado.</w:t>
             </w:r>
           </w:p>
         </w:tc>
@@ -3247,7 +3179,7 @@
               <w:rPr>
                 <w:sz w:val="15"/>
               </w:rPr>
-              <w:t>src/lib/ai; src/app/api/ai</w:t>
+              <w:t>Nenhuma implementação mobile localizada</w:t>
             </w:r>
           </w:p>
         </w:tc>
@@ -3269,7 +3201,7 @@
               <w:rPr>
                 <w:sz w:val="15"/>
               </w:rPr>
-              <w:t>Aplicação Mobile</w:t>
+              <w:t>Infraestrutura</w:t>
             </w:r>
           </w:p>
         </w:tc>
@@ -3285,7 +3217,7 @@
               <w:rPr>
                 <w:sz w:val="15"/>
               </w:rPr>
-              <w:t>[ANOTAÇÃO — DECISÃO TÉCNICA PENDENTE]: não existe aplicativo mobile no repositório auditado.</w:t>
+              <w:t>Docker/Docker Compose; documentação de Vercel e Supabase; Upstash Redis opcional para rate limit distribuído.</w:t>
             </w:r>
           </w:p>
         </w:tc>
@@ -3301,7 +3233,7 @@
               <w:rPr>
                 <w:sz w:val="15"/>
               </w:rPr>
-              <w:t>Nenhuma implementação mobile localizada</w:t>
+              <w:t>Dockerfile; docker-compose*.yml; docs/DEPLOYMENT.md</w:t>
             </w:r>
           </w:p>
         </w:tc>
@@ -3323,7 +3255,7 @@
               <w:rPr>
                 <w:sz w:val="15"/>
               </w:rPr>
-              <w:t>Infraestrutura</w:t>
+              <w:t>APIs</w:t>
             </w:r>
           </w:p>
         </w:tc>
@@ -3339,7 +3271,7 @@
               <w:rPr>
                 <w:sz w:val="15"/>
               </w:rPr>
-              <w:t>Docker/Docker Compose; documentação de Vercel e Supabase; Upstash Redis opcional para rate limit distribuído.</w:t>
+              <w:t>REST/JSON internas; Supabase; execução de código por Wandbox/Judge0.</w:t>
             </w:r>
           </w:p>
         </w:tc>
@@ -3355,61 +3287,7 @@
               <w:rPr>
                 <w:sz w:val="15"/>
               </w:rPr>
-              <w:t>Dockerfile; docker-compose*.yml; docs/DEPLOYMENT.md</w:t>
-            </w:r>
-          </w:p>
-        </w:tc>
-      </w:tr>
-      <w:tr>
-        <w:trPr>
-          <w:cantSplit/>
-          <w:jc w:val="center"/>
-        </w:trPr>
-        <w:tc>
-          <w:tcPr>
-            <w:tcW w:w="1944" w:type="dxa"/>
-          </w:tcPr>
-          <w:p>
-            <w:pPr>
-              <w:spacing w:after="0"/>
-            </w:pPr>
-            <w:r>
-              <w:rPr>
-                <w:sz w:val="15"/>
-              </w:rPr>
-              <w:t>APIs</w:t>
-            </w:r>
-          </w:p>
-        </w:tc>
-        <w:tc>
-          <w:tcPr>
-            <w:tcW w:w="5472" w:type="dxa"/>
-          </w:tcPr>
-          <w:p>
-            <w:pPr>
-              <w:spacing w:after="0"/>
-            </w:pPr>
-            <w:r>
-              <w:rPr>
-                <w:sz w:val="15"/>
-              </w:rPr>
-              <w:t>REST/JSON internas; Supabase; execução de código por Wandbox/Judge0; GitHub para análise autorizada; provedores de IA opcionais.</w:t>
-            </w:r>
-          </w:p>
-        </w:tc>
-        <w:tc>
-          <w:tcPr>
-            <w:tcW w:w="2304" w:type="dxa"/>
-          </w:tcPr>
-          <w:p>
-            <w:pPr>
-              <w:spacing w:after="0"/>
-            </w:pPr>
-            <w:r>
-              <w:rPr>
-                <w:sz w:val="15"/>
-              </w:rPr>
-              <w:t>src/app/api; src/lib/code-runner.ts; src/lib/github.ts</w:t>
+              <w:t>src/app/api; src/lib/code-runner.ts</w:t>
             </w:r>
           </w:p>
         </w:tc>
@@ -3572,7 +3450,7 @@
       <w:pPr>
         <w:pStyle w:val="Ttulo1"/>
       </w:pPr>
-      <w:bookmarkStart w:id="8" w:name="_Toc238247504"/>
+      <w:bookmarkStart w:id="8" w:name="_Toc239529449"/>
       <w:r>
         <w:t>7. Riscos</w:t>
       </w:r>
@@ -5611,7 +5489,7 @@
       <w:pPr>
         <w:pStyle w:val="Ttulo1"/>
       </w:pPr>
-      <w:bookmarkStart w:id="9" w:name="_Toc238247505"/>
+      <w:bookmarkStart w:id="9" w:name="_Toc239529450"/>
       <w:r>
         <w:lastRenderedPageBreak/>
         <w:t>8. Cronograma de Marcos Resumido</w:t>
@@ -6519,7 +6397,7 @@
       <w:pPr>
         <w:pStyle w:val="Ttulo1"/>
       </w:pPr>
-      <w:bookmarkStart w:id="10" w:name="_Toc238247506"/>
+      <w:bookmarkStart w:id="10" w:name="_Toc239529451"/>
       <w:r>
         <w:t>9. Orçamento Resumido</w:t>
       </w:r>
@@ -7747,7 +7625,7 @@
             <w:rPr>
               <w:sz w:val="16"/>
             </w:rPr>
-            <w:t>Versão do documento: 1.0</w:t>
+            <w:t>Versão 2.0 | Revisão técnica 05/09/2026</w:t>
           </w:r>
         </w:p>
       </w:tc>
@@ -9343,7 +9221,7 @@
       <w:rFonts w:cs="Arial"/>
       <w:b/>
       <w:bCs/>
-      <w:color w:val="111827"/>
+      <w:color w:val="000000"/>
       <w:kern w:val="32"/>
       <w:sz w:val="36"/>
       <w:szCs w:val="32"/>
@@ -9366,7 +9244,7 @@
       <w:bCs/>
       <w:i/>
       <w:iCs/>
-      <w:color w:val="111827"/>
+      <w:color w:val="000000"/>
       <w:sz w:val="28"/>
       <w:szCs w:val="28"/>
     </w:rPr>
@@ -9386,7 +9264,7 @@
       <w:rFonts w:cs="Arial"/>
       <w:b/>
       <w:bCs/>
-      <w:color w:val="111827"/>
+      <w:color w:val="000000"/>
       <w:sz w:val="24"/>
       <w:szCs w:val="26"/>
     </w:rPr>
@@ -9616,6 +9494,12 @@
         <w:insideV w:val="single" w:sz="4" w:space="0" w:color="auto"/>
       </w:tblBorders>
     </w:tblPr>
+  </w:style>
+  <w:style w:type="paragraph" w:customStyle="1" w:styleId="Ttulo10">
+    <w:name w:val="Título1"/>
+  </w:style>
+  <w:style w:type="paragraph" w:customStyle="1" w:styleId="Ttulo20">
+    <w:name w:val="Título2"/>
   </w:style>
 </w:styles>
 </file>

</xml_diff>